<commit_message>
Name the PRD metrics section after the guideline
The guidelines require "a dedicated North Star & Metrics section". The
content was already there - the North Star is the first row of the
section 12 table - but the heading read only "Success Metrics", so the
phrase was not findable from the contents page.

Co-Authored-By: Claude Opus 5 <noreply@anthropic.com>
Claude-Session: https://claude.ai/code/session_019bcVNmCuCyUN8zPnc4pyVf
</commit_message>
<xml_diff>
--- a/deliverables/Capstone2_AI_PM_PanchamLohumi_CRA_PRD.docx
+++ b/deliverables/Capstone2_AI_PM_PanchamLohumi_CRA_PRD.docx
@@ -293,7 +293,7 @@
           <w:sz w:val="24"/>
           <w:szCs w:val="24"/>
         </w:rPr>
-        <w:t>12. Success Metrics</w:t>
+        <w:t>12. North Star &amp; Success Metrics</w:t>
       </w:r>
     </w:p>
     <w:p>
@@ -8903,7 +8903,7 @@
           <w:sz w:val="38"/>
           <w:szCs w:val="38"/>
         </w:rPr>
-        <w:t>12. Success Metrics</w:t>
+        <w:t>12. North Star &amp; Success Metrics</w:t>
       </w:r>
       <w:r>
         <w:rPr>

</xml_diff>